<commit_message>
Changes related to Bullet points issue
</commit_message>
<xml_diff>
--- a/PHOCS-Docgentemplates/PHOCS Dairy Plant Licence Template_V2.0.docx
+++ b/PHOCS-Docgentemplates/PHOCS Dairy Plant Licence Template_V2.0.docx
@@ -491,7 +491,6 @@
         </w:rPr>
         <w:t xml:space="preserve"> </w:t>
       </w:r>
-      <w:proofErr w:type="gramStart"/>
       <w:r>
         <w:rPr>
           <w:rFonts w:ascii="Arial" w:hAnsi="Arial" w:cs="Arial"/>
@@ -519,15 +518,7 @@
           <w:rFonts w:ascii="Arial" w:eastAsiaTheme="majorEastAsia" w:hAnsi="Arial" w:cs="Arial"/>
           <w:color w:val="011893"/>
         </w:rPr>
-        <w:t>{</w:t>
-      </w:r>
-      <w:proofErr w:type="gramEnd"/>
-      <w:r>
-        <w:rPr>
-          <w:rFonts w:ascii="Arial" w:eastAsiaTheme="majorEastAsia" w:hAnsi="Arial" w:cs="Arial"/>
-          <w:color w:val="011893"/>
-        </w:rPr>
-        <w:t xml:space="preserve">{#IF_isConditionNotPresent}} </w:t>
+        <w:t xml:space="preserve">{{#IF_isConditionNotPresent}} </w:t>
       </w:r>
     </w:p>
     <w:p>
@@ -549,39 +540,49 @@
           <w:rFonts w:ascii="Arial" w:eastAsiaTheme="majorEastAsia" w:hAnsi="Arial" w:cs="Arial"/>
           <w:color w:val="011893"/>
         </w:rPr>
-        <w:t xml:space="preserve"> None{{/IF_isConditionNotPresent</w:t>
-      </w:r>
-      <w:proofErr w:type="gramStart"/>
+        <w:t xml:space="preserve"> None{{/IF_isConditionNotPresent}}</w:t>
+      </w:r>
       <w:r>
         <w:rPr>
           <w:rFonts w:ascii="Arial" w:eastAsiaTheme="majorEastAsia" w:hAnsi="Arial" w:cs="Arial"/>
           <w:color w:val="011893"/>
         </w:rPr>
-        <w:t>}}{</w:t>
-      </w:r>
-      <w:proofErr w:type="gramEnd"/>
+        <w:t>{{#</w:t>
+      </w:r>
       <w:r>
         <w:rPr>
           <w:rFonts w:ascii="Arial" w:eastAsiaTheme="majorEastAsia" w:hAnsi="Arial" w:cs="Arial"/>
           <w:color w:val="011893"/>
         </w:rPr>
-        <w:t>{#BusinessLicense</w:t>
-      </w:r>
-      <w:proofErr w:type="gramStart"/>
+        <w:t>IF_is</w:t>
+      </w:r>
       <w:r>
         <w:rPr>
           <w:rFonts w:ascii="Arial" w:eastAsiaTheme="majorEastAsia" w:hAnsi="Arial" w:cs="Arial"/>
           <w:color w:val="011893"/>
         </w:rPr>
-        <w:t>}}{</w:t>
-      </w:r>
-      <w:proofErr w:type="gramEnd"/>
+        <w:t>Cn</w:t>
+      </w:r>
       <w:r>
         <w:rPr>
           <w:rFonts w:ascii="Arial" w:eastAsiaTheme="majorEastAsia" w:hAnsi="Arial" w:cs="Arial"/>
           <w:color w:val="011893"/>
         </w:rPr>
-        <w:t>{#Conditions}}</w:t>
+        <w:t>Pst</w:t>
+      </w:r>
+      <w:r>
+        <w:rPr>
+          <w:rFonts w:ascii="Arial" w:eastAsiaTheme="majorEastAsia" w:hAnsi="Arial" w:cs="Arial"/>
+          <w:color w:val="011893"/>
+        </w:rPr>
+        <w:t>}}</w:t>
+      </w:r>
+      <w:r>
+        <w:rPr>
+          <w:rFonts w:ascii="Arial" w:eastAsiaTheme="majorEastAsia" w:hAnsi="Arial" w:cs="Arial"/>
+          <w:color w:val="011893"/>
+        </w:rPr>
+        <w:t>{{#BusinessLicense}}{{#Conditions}}</w:t>
       </w:r>
     </w:p>
     <w:p>
@@ -606,55 +607,28 @@
           <w:rFonts w:ascii="Arial" w:eastAsiaTheme="majorEastAsia" w:hAnsi="Arial" w:cs="Arial"/>
           <w:color w:val="011893"/>
         </w:rPr>
-        <w:t xml:space="preserve"> {{Description</w:t>
-      </w:r>
-      <w:proofErr w:type="gramStart"/>
+        <w:t xml:space="preserve"> {{Description}}{{/Conditions}}{{/BusinessLicense}}</w:t>
+      </w:r>
       <w:r>
         <w:rPr>
           <w:rFonts w:ascii="Arial" w:eastAsiaTheme="majorEastAsia" w:hAnsi="Arial" w:cs="Arial"/>
           <w:color w:val="011893"/>
         </w:rPr>
-        <w:t>}}{</w:t>
-      </w:r>
-      <w:proofErr w:type="gramEnd"/>
+        <w:t>{{</w:t>
+      </w:r>
       <w:r>
         <w:rPr>
           <w:rFonts w:ascii="Arial" w:eastAsiaTheme="majorEastAsia" w:hAnsi="Arial" w:cs="Arial"/>
           <w:color w:val="011893"/>
         </w:rPr>
-        <w:t>{/Conditions</w:t>
-      </w:r>
-      <w:proofErr w:type="gramStart"/>
+        <w:t>/</w:t>
+      </w:r>
       <w:r>
         <w:rPr>
           <w:rFonts w:ascii="Arial" w:eastAsiaTheme="majorEastAsia" w:hAnsi="Arial" w:cs="Arial"/>
           <w:color w:val="011893"/>
         </w:rPr>
-        <w:t>}}{</w:t>
-      </w:r>
-      <w:proofErr w:type="gramEnd"/>
-      <w:r>
-        <w:rPr>
-          <w:rFonts w:ascii="Arial" w:eastAsiaTheme="majorEastAsia" w:hAnsi="Arial" w:cs="Arial"/>
-          <w:color w:val="011893"/>
-        </w:rPr>
-        <w:t>{/</w:t>
-      </w:r>
-      <w:proofErr w:type="spellStart"/>
-      <w:r>
-        <w:rPr>
-          <w:rFonts w:ascii="Arial" w:eastAsiaTheme="majorEastAsia" w:hAnsi="Arial" w:cs="Arial"/>
-          <w:color w:val="011893"/>
-        </w:rPr>
-        <w:t>BusinessLicense</w:t>
-      </w:r>
-      <w:proofErr w:type="spellEnd"/>
-      <w:r>
-        <w:rPr>
-          <w:rFonts w:ascii="Arial" w:eastAsiaTheme="majorEastAsia" w:hAnsi="Arial" w:cs="Arial"/>
-          <w:color w:val="011893"/>
-        </w:rPr>
-        <w:t>}}</w:t>
+        <w:t>IF_isCnPst}}</w:t>
       </w:r>
     </w:p>
     <w:p>
@@ -4279,7 +4253,6 @@
   <w:style w:type="character" w:default="1" w:styleId="DefaultParagraphFont">
     <w:name w:val="Default Paragraph Font"/>
     <w:uiPriority w:val="1"/>
-    <w:semiHidden/>
     <w:unhideWhenUsed/>
   </w:style>
   <w:style w:type="table" w:default="1" w:styleId="TableNormal">
@@ -5083,6 +5056,21 @@
 </file>
 
 <file path=customXml/item1.xml><?xml version="1.0" encoding="utf-8"?>
+<p:properties xmlns:p="http://schemas.microsoft.com/office/2006/metadata/properties" xmlns:xsi="http://www.w3.org/2001/XMLSchema-instance" xmlns:pc="http://schemas.microsoft.com/office/infopath/2007/PartnerControls">
+  <documentManagement>
+    <TaxCatchAll xmlns="8350b7c0-334b-4e19-bfc1-744f6a979eee" xsi:nil="true"/>
+    <lcf76f155ced4ddcb4097134ff3c332f xmlns="94d5cf59-5162-48bc-aa9b-620df72947f5">
+      <Terms xmlns="http://schemas.microsoft.com/office/infopath/2007/PartnerControls"/>
+    </lcf76f155ced4ddcb4097134ff3c332f>
+  </documentManagement>
+</p:properties>
+</file>
+
+<file path=customXml/item2.xml><?xml version="1.0" encoding="utf-8"?>
+<b:Sources xmlns:b="http://schemas.openxmlformats.org/officeDocument/2006/bibliography" xmlns="http://schemas.openxmlformats.org/officeDocument/2006/bibliography" SelectedStyle="\APASixthEditionOfficeOnline.xsl" StyleName="APA" Version="6"/>
+</file>
+
+<file path=customXml/item3.xml><?xml version="1.0" encoding="utf-8"?>
 <ct:contentTypeSchema xmlns:ct="http://schemas.microsoft.com/office/2006/metadata/contentType" xmlns:ma="http://schemas.microsoft.com/office/2006/metadata/properties/metaAttributes" ct:_="" ma:_="" ma:contentTypeName="Document" ma:contentTypeID="0x01010015F16144C0593A4A82C8AE0B67DB460F" ma:contentTypeVersion="11" ma:contentTypeDescription="Create a new document." ma:contentTypeScope="" ma:versionID="3a2406281bee02c64b898b19359b591a">
   <xsd:schema xmlns:xsd="http://www.w3.org/2001/XMLSchema" xmlns:xs="http://www.w3.org/2001/XMLSchema" xmlns:p="http://schemas.microsoft.com/office/2006/metadata/properties" xmlns:ns2="94d5cf59-5162-48bc-aa9b-620df72947f5" xmlns:ns3="8350b7c0-334b-4e19-bfc1-744f6a979eee" targetNamespace="http://schemas.microsoft.com/office/2006/metadata/properties" ma:root="true" ma:fieldsID="a1c36f1dd46451d6740df434f8fe57b2" ns2:_="" ns3:_="">
     <xsd:import namespace="94d5cf59-5162-48bc-aa9b-620df72947f5"/>
@@ -5277,21 +5265,6 @@
 </ct:contentTypeSchema>
 </file>
 
-<file path=customXml/item2.xml><?xml version="1.0" encoding="utf-8"?>
-<b:Sources xmlns:b="http://schemas.openxmlformats.org/officeDocument/2006/bibliography" xmlns="http://schemas.openxmlformats.org/officeDocument/2006/bibliography" SelectedStyle="\APASixthEditionOfficeOnline.xsl" StyleName="APA" Version="6"/>
-</file>
-
-<file path=customXml/item3.xml><?xml version="1.0" encoding="utf-8"?>
-<p:properties xmlns:p="http://schemas.microsoft.com/office/2006/metadata/properties" xmlns:xsi="http://www.w3.org/2001/XMLSchema-instance" xmlns:pc="http://schemas.microsoft.com/office/infopath/2007/PartnerControls">
-  <documentManagement>
-    <TaxCatchAll xmlns="8350b7c0-334b-4e19-bfc1-744f6a979eee" xsi:nil="true"/>
-    <lcf76f155ced4ddcb4097134ff3c332f xmlns="94d5cf59-5162-48bc-aa9b-620df72947f5">
-      <Terms xmlns="http://schemas.microsoft.com/office/infopath/2007/PartnerControls"/>
-    </lcf76f155ced4ddcb4097134ff3c332f>
-  </documentManagement>
-</p:properties>
-</file>
-
 <file path=customXml/item4.xml><?xml version="1.0" encoding="utf-8"?>
 <?mso-contentType ?>
 <FormTemplates xmlns="http://schemas.microsoft.com/sharepoint/v3/contenttype/forms">
@@ -5302,6 +5275,25 @@
 </file>
 
 <file path=customXml/itemProps1.xml><?xml version="1.0" encoding="utf-8"?>
+<ds:datastoreItem xmlns:ds="http://schemas.openxmlformats.org/officeDocument/2006/customXml" ds:itemID="{025C8078-51DC-4841-BA80-19788F4265C1}">
+  <ds:schemaRefs>
+    <ds:schemaRef ds:uri="http://schemas.microsoft.com/office/2006/metadata/properties"/>
+    <ds:schemaRef ds:uri="http://schemas.microsoft.com/office/infopath/2007/PartnerControls"/>
+    <ds:schemaRef ds:uri="8350b7c0-334b-4e19-bfc1-744f6a979eee"/>
+    <ds:schemaRef ds:uri="94d5cf59-5162-48bc-aa9b-620df72947f5"/>
+  </ds:schemaRefs>
+</ds:datastoreItem>
+</file>
+
+<file path=customXml/itemProps2.xml><?xml version="1.0" encoding="utf-8"?>
+<ds:datastoreItem xmlns:ds="http://schemas.openxmlformats.org/officeDocument/2006/customXml" ds:itemID="{05547FD2-9942-43BC-9F0A-00017A93FCEF}">
+  <ds:schemaRefs>
+    <ds:schemaRef ds:uri="http://schemas.openxmlformats.org/officeDocument/2006/bibliography"/>
+  </ds:schemaRefs>
+</ds:datastoreItem>
+</file>
+
+<file path=customXml/itemProps3.xml><?xml version="1.0" encoding="utf-8"?>
 <ds:datastoreItem xmlns:ds="http://schemas.openxmlformats.org/officeDocument/2006/customXml" ds:itemID="{178278FC-D372-45DA-A322-1EBDB87E766B}">
   <ds:schemaRefs>
     <ds:schemaRef ds:uri="http://schemas.microsoft.com/office/2006/metadata/contentType"/>
@@ -5320,25 +5312,6 @@
 </ds:datastoreItem>
 </file>
 
-<file path=customXml/itemProps2.xml><?xml version="1.0" encoding="utf-8"?>
-<ds:datastoreItem xmlns:ds="http://schemas.openxmlformats.org/officeDocument/2006/customXml" ds:itemID="{05547FD2-9942-43BC-9F0A-00017A93FCEF}">
-  <ds:schemaRefs>
-    <ds:schemaRef ds:uri="http://schemas.openxmlformats.org/officeDocument/2006/bibliography"/>
-  </ds:schemaRefs>
-</ds:datastoreItem>
-</file>
-
-<file path=customXml/itemProps3.xml><?xml version="1.0" encoding="utf-8"?>
-<ds:datastoreItem xmlns:ds="http://schemas.openxmlformats.org/officeDocument/2006/customXml" ds:itemID="{025C8078-51DC-4841-BA80-19788F4265C1}">
-  <ds:schemaRefs>
-    <ds:schemaRef ds:uri="http://schemas.microsoft.com/office/2006/metadata/properties"/>
-    <ds:schemaRef ds:uri="http://schemas.microsoft.com/office/infopath/2007/PartnerControls"/>
-    <ds:schemaRef ds:uri="8350b7c0-334b-4e19-bfc1-744f6a979eee"/>
-    <ds:schemaRef ds:uri="94d5cf59-5162-48bc-aa9b-620df72947f5"/>
-  </ds:schemaRefs>
-</ds:datastoreItem>
-</file>
-
 <file path=customXml/itemProps4.xml><?xml version="1.0" encoding="utf-8"?>
 <ds:datastoreItem xmlns:ds="http://schemas.openxmlformats.org/officeDocument/2006/customXml" ds:itemID="{EBC42ABD-C067-4102-BEC1-787B36D5DB6C}">
   <ds:schemaRefs>

</xml_diff>